<commit_message>
Switch DB to ecommerce_db1 and fix expiry calc
Update datasource URL to use ecommerce_db1 in application.properties (src and target/classes) and make document expiry calculation more robust: avoid null access if evaluation_date is missing, fall back to today, then set expiration to 3 years ahead. Also updates the uploaded doc_8.docx binary.
</commit_message>
<xml_diff>
--- a/shopping-cart-spring-boot-main/uploads/academic/8/doc_8.docx
+++ b/shopping-cart-spring-boot-main/uploads/academic/8/doc_8.docx
@@ -187,44 +187,81 @@
       </w:r>
       <w:r>
         <w:rPr>
-          <w:rFonts w:ascii="TH Sarabun New" w:hAnsi="TH Sarabun New" w:cs="TH Sarabun New"/>
-          <w:sz w:val="32"/>
-          <w:szCs w:val="32"/>
-          <w:cs/>
-        </w:rPr>
-        <w:t>อว 660301.</w:t>
-      </w:r>
-      <w:r>
-        <w:rPr>
-          <w:rFonts w:ascii="TH Sarabun New" w:hAnsi="TH Sarabun New" w:cs="TH Sarabun New" w:hint="cs"/>
-          <w:sz w:val="32"/>
-          <w:szCs w:val="32"/>
-          <w:cs/>
-        </w:rPr>
-        <w:t>26.4</w:t>
-      </w:r>
-      <w:r>
-        <w:rPr>
-          <w:rFonts w:ascii="TH Sarabun New" w:hAnsi="TH Sarabun New" w:cs="TH Sarabun New" w:hint="cs"/>
-          <w:color w:val="000000" w:themeColor="text1"/>
-          <w:sz w:val="32"/>
-          <w:szCs w:val="32"/>
-          <w:cs/>
+          <w:rFonts w:ascii="TH Sarabun New" w:eastAsia="Times New Roman" w:hAnsi="TH Sarabun New" w:cs="TH Sarabun New"/>
+          <w:color w:val="000000" w:themeColor="text1"/>
+          <w:sz w:val="32"/>
+          <w:szCs w:val="32"/>
+          <w:cs/>
+          <w:lang w:eastAsia="en-GB"/>
+        </w:rPr>
+        <w:t xml:space="preserve">อว </w:t>
+      </w:r>
+      <w:r>
+        <w:rPr>
+          <w:rFonts w:ascii="TH Sarabun New" w:eastAsia="Times New Roman" w:hAnsi="TH Sarabun New" w:cs="TH Sarabun New"/>
+          <w:color w:val="000000" w:themeColor="text1"/>
+          <w:sz w:val="32"/>
+          <w:szCs w:val="32"/>
+          <w:lang w:eastAsia="en-GB"/>
+        </w:rPr>
+        <w:t>660301</w:t>
+      </w:r>
+      <w:r>
+        <w:rPr>
+          <w:rFonts w:ascii="TH Sarabun New" w:eastAsia="Times New Roman" w:hAnsi="TH Sarabun New" w:cs="TH Sarabun New"/>
+          <w:color w:val="000000" w:themeColor="text1"/>
+          <w:sz w:val="32"/>
+          <w:szCs w:val="32"/>
+          <w:cs/>
+          <w:lang w:eastAsia="en-GB"/>
+        </w:rPr>
+        <w:t>.</w:t>
+      </w:r>
+      <w:r>
+        <w:rPr>
+          <w:rFonts w:ascii="TH Sarabun New" w:eastAsia="Times New Roman" w:hAnsi="TH Sarabun New" w:cs="TH Sarabun New"/>
+          <w:color w:val="000000" w:themeColor="text1"/>
+          <w:sz w:val="32"/>
+          <w:szCs w:val="32"/>
+          <w:lang w:eastAsia="en-GB"/>
+        </w:rPr>
+        <w:t>26</w:t>
+      </w:r>
+      <w:r>
+        <w:rPr>
+          <w:rFonts w:ascii="TH Sarabun New" w:eastAsia="Times New Roman" w:hAnsi="TH Sarabun New" w:cs="TH Sarabun New"/>
+          <w:color w:val="000000" w:themeColor="text1"/>
+          <w:sz w:val="32"/>
+          <w:szCs w:val="32"/>
+          <w:cs/>
+          <w:lang w:eastAsia="en-GB"/>
+        </w:rPr>
+        <w:t>.</w:t>
+      </w:r>
+      <w:r>
+        <w:rPr>
+          <w:rFonts w:ascii="TH Sarabun New" w:eastAsia="Times New Roman" w:hAnsi="TH Sarabun New" w:cs="TH Sarabun New" w:hint="cs"/>
+          <w:color w:val="000000" w:themeColor="text1"/>
+          <w:sz w:val="32"/>
+          <w:szCs w:val="32"/>
+          <w:cs/>
+          <w:lang w:eastAsia="en-GB"/>
+        </w:rPr>
+        <w:t>4</w:t>
+      </w:r>
+      <w:r>
+        <w:rPr>
+          <w:rFonts w:ascii="TH Sarabun New" w:eastAsia="Times New Roman" w:hAnsi="TH Sarabun New" w:cs="TH Sarabun New"/>
+          <w:color w:val="000000" w:themeColor="text1"/>
+          <w:sz w:val="32"/>
+          <w:szCs w:val="32"/>
+          <w:cs/>
+          <w:lang w:eastAsia="en-GB"/>
         </w:rPr>
         <w:t>/</w:t>
       </w:r>
       <w:r>
         <w:rPr>
-          <w:rFonts w:ascii="TH Sarabun New" w:hAnsi="TH Sarabun New" w:cs="TH Sarabun New" w:hint="cs"/>
-          <w:color w:val="000000" w:themeColor="text1"/>
-          <w:sz w:val="32"/>
-          <w:szCs w:val="32"/>
-          <w:cs/>
-        </w:rPr>
-        <w:t xml:space="preserve"> </w:t>
-      </w:r>
-      <w:r>
-        <w:rPr>
           <w:rFonts w:ascii="TH Sarabun New" w:hAnsi="TH Sarabun New" w:cs="TH Sarabun New"/>
           <w:color w:val="000000" w:themeColor="text1"/>
           <w:sz w:val="32"/>
@@ -232,7 +269,6 @@
         </w:rPr>
         <w:t>2222222222</w:t>
       </w:r>
-      <w:proofErr w:type="spellStart"/>
       <w:r>
         <w:rPr>
           <w:rFonts w:ascii="TH Sarabun New" w:hAnsi="TH Sarabun New" w:cs="TH Sarabun New"/>
@@ -242,7 +278,6 @@
         </w:rPr>
         <w:t/>
       </w:r>
-      <w:proofErr w:type="spellEnd"/>
       <w:r>
         <w:rPr>
           <w:rFonts w:ascii="TH Sarabun New" w:hAnsi="TH Sarabun New" w:cs="TH Sarabun New"/>
@@ -323,7 +358,7 @@
           <w:sz w:val="32"/>
           <w:szCs w:val="32"/>
         </w:rPr>
-        <w:t>9 มีนาคม 2569</w:t>
+        <w:t>10 มีนาคม 2569</w:t>
       </w:r>
       <w:r>
         <w:rPr>
@@ -466,32 +501,12 @@
         </w:rPr>
         <w:t>นาย</w:t>
       </w:r>
-      <w:proofErr w:type="spellStart"/>
-      <w:r>
-        <w:rPr>
-          <w:rFonts w:ascii="TH Sarabun New" w:hAnsi="TH Sarabun New" w:cs="TH Sarabun New"/>
-          <w:sz w:val="32"/>
-          <w:szCs w:val="32"/>
-        </w:rPr>
+      <w:r>
+        <w:t>jo</w:t>
+      </w:r>
+      <w:r>
         <w:t/>
       </w:r>
-      <w:proofErr w:type="spellEnd"/>
-      <w:r>
-        <w:rPr>
-          <w:rFonts w:ascii="TH Sarabun New" w:hAnsi="TH Sarabun New" w:cs="TH Sarabun New"/>
-          <w:sz w:val="32"/>
-          <w:szCs w:val="32"/>
-        </w:rPr>
-        <w:t/>
-      </w:r>
-      <w:r>
-        <w:t>jo</w:t>
-      </w:r>
-      <w:proofErr w:type="spellStart"/>
-      <w:r>
-        <w:t/>
-      </w:r>
-      <w:proofErr w:type="spellEnd"/>
       <w:r>
         <w:t/>
       </w:r>
@@ -534,9 +549,8 @@
           <w:sz w:val="32"/>
           <w:szCs w:val="32"/>
         </w:rPr>
-        <w:t>2/1234 </w:t>
-      </w:r>
-      <w:proofErr w:type="spellStart"/>
+        <w:t>1234 </w:t>
+      </w:r>
       <w:r>
         <w:rPr>
           <w:rFonts w:ascii="TH Sarabun New" w:eastAsia="Angsana New" w:hAnsi="TH Sarabun New" w:cs="TH Sarabun New"/>
@@ -546,7 +560,6 @@
         </w:rPr>
         <w:t/>
       </w:r>
-      <w:proofErr w:type="spellEnd"/>
       <w:r>
         <w:rPr>
           <w:rFonts w:ascii="TH Sarabun New" w:eastAsia="Angsana New" w:hAnsi="TH Sarabun New" w:cs="TH Sarabun New"/>
@@ -573,9 +586,8 @@
           <w:sz w:val="32"/>
           <w:szCs w:val="32"/>
         </w:rPr>
-        <w:t>9 มีนาคม 2569</w:t>
-      </w:r>
-      <w:proofErr w:type="spellStart"/>
+        <w:t>10 มีนาคม 2569</w:t>
+      </w:r>
       <w:r>
         <w:rPr>
           <w:rFonts w:ascii="TH Sarabun New" w:eastAsia="Angsana New" w:hAnsi="TH Sarabun New" w:cs="TH Sarabun New"/>
@@ -594,7 +606,36 @@
         </w:rPr>
         <w:t/>
       </w:r>
-      <w:proofErr w:type="spellEnd"/>
+      <w:r>
+        <w:rPr>
+          <w:rFonts w:ascii="TH Sarabun New" w:eastAsia="Angsana New" w:hAnsi="TH Sarabun New" w:cs="TH Sarabun New" w:hint="cs"/>
+          <w:color w:val="000000" w:themeColor="text1"/>
+          <w:sz w:val="32"/>
+          <w:szCs w:val="32"/>
+          <w:cs/>
+        </w:rPr>
+        <w:t xml:space="preserve"> </w:t>
+      </w:r>
+      <w:r>
+        <w:rPr>
+          <w:rFonts w:ascii="TH Sarabun New" w:eastAsia="Angsana New" w:hAnsi="TH Sarabun New" w:cs="TH Sarabun New" w:hint="cs"/>
+          <w:color w:val="000000" w:themeColor="text1"/>
+          <w:sz w:val="32"/>
+          <w:szCs w:val="32"/>
+          <w:cs/>
+        </w:rPr>
+        <w:t>ท่านได้แจ้งความประสงค์ขอประเมินผลการสอนในรายวิชา</w:t>
+      </w:r>
+      <w:r>
+        <w:rPr>
+          <w:rFonts w:ascii="TH Sarabun New" w:eastAsia="Angsana New" w:hAnsi="TH Sarabun New" w:cs="TH Sarabun New" w:hint="cs"/>
+          <w:color w:val="000000" w:themeColor="text1"/>
+          <w:sz w:val="32"/>
+          <w:szCs w:val="32"/>
+          <w:cs/>
+        </w:rPr>
+        <w:t xml:space="preserve"> </w:t>
+      </w:r>
       <w:r>
         <w:rPr>
           <w:rFonts w:ascii="TH Sarabun New" w:eastAsia="Angsana New" w:hAnsi="TH Sarabun New" w:cs="TH Sarabun New"/>
@@ -602,11 +643,29 @@
           <w:sz w:val="32"/>
           <w:szCs w:val="32"/>
         </w:rPr>
+        <w:t>dsad213</w:t>
+      </w:r>
+      <w:r>
+        <w:rPr>
+          <w:rFonts w:ascii="TH Sarabun New" w:hAnsi="TH Sarabun New" w:cs="TH Sarabun New"/>
+          <w:color w:val="000000" w:themeColor="text1"/>
+          <w:sz w:val="32"/>
+          <w:szCs w:val="32"/>
+        </w:rPr>
         <w:t/>
       </w:r>
       <w:r>
         <w:rPr>
-          <w:rFonts w:ascii="TH Sarabun New" w:eastAsia="Angsana New" w:hAnsi="TH Sarabun New" w:cs="TH Sarabun New" w:hint="cs"/>
+          <w:rFonts w:ascii="TH Sarabun New" w:hAnsi="TH Sarabun New" w:cs="TH Sarabun New"/>
+          <w:color w:val="000000" w:themeColor="text1"/>
+          <w:sz w:val="32"/>
+          <w:szCs w:val="32"/>
+        </w:rPr>
+        <w:t/>
+      </w:r>
+      <w:r>
+        <w:rPr>
+          <w:rFonts w:ascii="TH Sarabun New" w:hAnsi="TH Sarabun New" w:cs="TH Sarabun New" w:hint="cs"/>
           <w:color w:val="000000" w:themeColor="text1"/>
           <w:sz w:val="32"/>
           <w:szCs w:val="32"/>
@@ -616,126 +675,46 @@
       </w:r>
       <w:r>
         <w:rPr>
-          <w:rFonts w:ascii="TH Sarabun New" w:eastAsia="Angsana New" w:hAnsi="TH Sarabun New" w:cs="TH Sarabun New" w:hint="cs"/>
-          <w:color w:val="000000" w:themeColor="text1"/>
-          <w:sz w:val="32"/>
-          <w:szCs w:val="32"/>
-          <w:cs/>
-        </w:rPr>
-        <w:t>ท่านได้แจ้งความประสงค์ขอประเมินผลการสอนในรายวิชา</w:t>
-      </w:r>
-      <w:r>
-        <w:rPr>
-          <w:rFonts w:ascii="TH Sarabun New" w:eastAsia="Angsana New" w:hAnsi="TH Sarabun New" w:cs="TH Sarabun New" w:hint="cs"/>
-          <w:color w:val="000000" w:themeColor="text1"/>
-          <w:sz w:val="32"/>
-          <w:szCs w:val="32"/>
-          <w:cs/>
-        </w:rPr>
-        <w:t xml:space="preserve"> </w:t>
-      </w:r>
-      <w:r>
-        <w:rPr>
-          <w:rFonts w:ascii="TH Sarabun New" w:eastAsia="Angsana New" w:hAnsi="TH Sarabun New" w:cs="TH Sarabun New"/>
-          <w:color w:val="000000" w:themeColor="text1"/>
-          <w:sz w:val="32"/>
-          <w:szCs w:val="32"/>
-        </w:rPr>
-        <w:t>dsad213</w:t>
-      </w:r>
-      <w:proofErr w:type="spellStart"/>
-      <w:r>
-        <w:rPr>
-          <w:rFonts w:ascii="TH Sarabun New" w:hAnsi="TH Sarabun New" w:cs="TH Sarabun New"/>
-          <w:color w:val="000000" w:themeColor="text1"/>
-          <w:sz w:val="32"/>
-          <w:szCs w:val="32"/>
+          <w:rFonts w:ascii="TH Sarabun New" w:hAnsi="TH Sarabun New" w:cs="TH Sarabun New" w:hint="cs"/>
+          <w:color w:val="000000" w:themeColor="text1"/>
+          <w:sz w:val="32"/>
+          <w:szCs w:val="32"/>
+          <w:shd w:val="clear" w:color="auto" w:fill="FFFFFF"/>
+          <w:cs/>
+        </w:rPr>
+        <w:t>รหัสวิชา</w:t>
+      </w:r>
+      <w:r>
+        <w:rPr>
+          <w:rFonts w:ascii="TH Sarabun New" w:hAnsi="TH Sarabun New" w:cs="TH Sarabun New"/>
+          <w:color w:val="000000" w:themeColor="text1"/>
+          <w:sz w:val="32"/>
+          <w:szCs w:val="32"/>
+          <w:shd w:val="clear" w:color="auto" w:fill="FFFFFF"/>
+          <w:cs/>
+        </w:rPr>
+        <w:t> </w:t>
+      </w:r>
+      <w:r>
+        <w:rPr>
+          <w:rFonts w:ascii="TH Sarabun New" w:hAnsi="TH Sarabun New" w:cs="TH Sarabun New"/>
+          <w:color w:val="000000" w:themeColor="text1"/>
+          <w:sz w:val="32"/>
+          <w:szCs w:val="32"/>
+          <w:shd w:val="clear" w:color="auto" w:fill="FFFFFF"/>
+        </w:rPr>
+        <w:t>CP 256 256 </w:t>
+      </w:r>
+      <w:r>
+        <w:rPr>
+          <w:rFonts w:ascii="TH Sarabun New" w:hAnsi="TH Sarabun New" w:cs="TH Sarabun New"/>
+          <w:color w:val="000000" w:themeColor="text1"/>
+          <w:sz w:val="32"/>
+          <w:szCs w:val="32"/>
+          <w:shd w:val="clear" w:color="auto" w:fill="FFFFFF"/>
         </w:rPr>
         <w:t/>
       </w:r>
-      <w:r>
-        <w:rPr>
-          <w:rFonts w:ascii="TH Sarabun New" w:hAnsi="TH Sarabun New" w:cs="TH Sarabun New"/>
-          <w:color w:val="000000" w:themeColor="text1"/>
-          <w:sz w:val="32"/>
-          <w:szCs w:val="32"/>
-        </w:rPr>
-        <w:t/>
-      </w:r>
-      <w:proofErr w:type="spellEnd"/>
-      <w:r>
-        <w:rPr>
-          <w:rFonts w:ascii="TH Sarabun New" w:hAnsi="TH Sarabun New" w:cs="TH Sarabun New"/>
-          <w:color w:val="000000" w:themeColor="text1"/>
-          <w:sz w:val="32"/>
-          <w:szCs w:val="32"/>
-        </w:rPr>
-        <w:t/>
-      </w:r>
-      <w:r>
-        <w:rPr>
-          <w:rFonts w:ascii="TH Sarabun New" w:hAnsi="TH Sarabun New" w:cs="TH Sarabun New" w:hint="cs"/>
-          <w:color w:val="000000" w:themeColor="text1"/>
-          <w:sz w:val="32"/>
-          <w:szCs w:val="32"/>
-          <w:cs/>
-        </w:rPr>
-        <w:t xml:space="preserve"> </w:t>
-      </w:r>
-      <w:r>
-        <w:rPr>
-          <w:rFonts w:ascii="TH Sarabun New" w:hAnsi="TH Sarabun New" w:cs="TH Sarabun New" w:hint="cs"/>
-          <w:color w:val="000000" w:themeColor="text1"/>
-          <w:sz w:val="32"/>
-          <w:szCs w:val="32"/>
-          <w:shd w:val="clear" w:color="auto" w:fill="FFFFFF"/>
-          <w:cs/>
-        </w:rPr>
-        <w:t>รหัสวิชา</w:t>
-      </w:r>
-      <w:r>
-        <w:rPr>
-          <w:rFonts w:ascii="TH Sarabun New" w:hAnsi="TH Sarabun New" w:cs="TH Sarabun New"/>
-          <w:color w:val="000000" w:themeColor="text1"/>
-          <w:sz w:val="32"/>
-          <w:szCs w:val="32"/>
-          <w:shd w:val="clear" w:color="auto" w:fill="FFFFFF"/>
-          <w:cs/>
-        </w:rPr>
-        <w:t> </w:t>
-      </w:r>
-      <w:r>
-        <w:rPr>
-          <w:rFonts w:ascii="TH Sarabun New" w:hAnsi="TH Sarabun New" w:cs="TH Sarabun New"/>
-          <w:color w:val="000000" w:themeColor="text1"/>
-          <w:sz w:val="32"/>
-          <w:szCs w:val="32"/>
-          <w:shd w:val="clear" w:color="auto" w:fill="FFFFFF"/>
-        </w:rPr>
-        <w:t>CP 256 256 </w:t>
-      </w:r>
-      <w:proofErr w:type="spellStart"/>
-      <w:r>
-        <w:rPr>
-          <w:rFonts w:ascii="TH Sarabun New" w:hAnsi="TH Sarabun New" w:cs="TH Sarabun New"/>
-          <w:color w:val="000000" w:themeColor="text1"/>
-          <w:sz w:val="32"/>
-          <w:szCs w:val="32"/>
-          <w:shd w:val="clear" w:color="auto" w:fill="FFFFFF"/>
-        </w:rPr>
-        <w:t/>
-      </w:r>
-      <w:r>
-        <w:rPr>
-          <w:rFonts w:ascii="TH Sarabun New" w:hAnsi="TH Sarabun New" w:cs="TH Sarabun New"/>
-          <w:color w:val="000000" w:themeColor="text1"/>
-          <w:sz w:val="32"/>
-          <w:szCs w:val="32"/>
-          <w:shd w:val="clear" w:color="auto" w:fill="FFFFFF"/>
-        </w:rPr>
-        <w:t/>
-      </w:r>
-      <w:proofErr w:type="spellEnd"/>
       <w:r>
         <w:rPr>
           <w:rFonts w:ascii="TH Sarabun New" w:hAnsi="TH Sarabun New" w:cs="TH Sarabun New"/>
@@ -821,7 +800,136 @@
         </w:rPr>
         <w:t>ศาสตราจารย์</w:t>
       </w:r>
-      <w:proofErr w:type="spellStart"/>
+      <w:r>
+        <w:rPr>
+          <w:rFonts w:ascii="TH Sarabun New" w:eastAsia="Times New Roman" w:hAnsi="TH Sarabun New" w:cs="TH Sarabun New" w:hint="cs"/>
+          <w:color w:val="000000" w:themeColor="text1"/>
+          <w:sz w:val="32"/>
+          <w:szCs w:val="32"/>
+          <w:cs/>
+          <w:lang w:eastAsia="en-GB"/>
+        </w:rPr>
+        <w:t xml:space="preserve"> ความ</w:t>
+      </w:r>
+      <w:r>
+        <w:rPr>
+          <w:rFonts w:ascii="TH Sarabun New" w:eastAsia="Times New Roman" w:hAnsi="TH Sarabun New" w:cs="TH Sarabun New" w:hint="cs"/>
+          <w:color w:val="000000" w:themeColor="text1"/>
+          <w:sz w:val="32"/>
+          <w:szCs w:val="32"/>
+          <w:cs/>
+          <w:lang w:eastAsia="en-GB"/>
+        </w:rPr>
+        <w:t>ละเอียดแจ้ง</w:t>
+      </w:r>
+      <w:r>
+        <w:rPr>
+          <w:rFonts w:ascii="TH Sarabun New" w:eastAsia="Times New Roman" w:hAnsi="TH Sarabun New" w:cs="TH Sarabun New" w:hint="cs"/>
+          <w:color w:val="000000" w:themeColor="text1"/>
+          <w:sz w:val="32"/>
+          <w:szCs w:val="32"/>
+          <w:cs/>
+          <w:lang w:eastAsia="en-GB"/>
+        </w:rPr>
+        <w:t>แ</w:t>
+      </w:r>
+      <w:r>
+        <w:rPr>
+          <w:rFonts w:ascii="TH Sarabun New" w:eastAsia="Times New Roman" w:hAnsi="TH Sarabun New" w:cs="TH Sarabun New" w:hint="cs"/>
+          <w:color w:val="000000" w:themeColor="text1"/>
+          <w:sz w:val="32"/>
+          <w:szCs w:val="32"/>
+          <w:cs/>
+          <w:lang w:eastAsia="en-GB"/>
+        </w:rPr>
+        <w:t>ล้วนั้น คณะกรรมการประเมินผลการสอน</w:t>
+      </w:r>
+      <w:r>
+        <w:rPr>
+          <w:rFonts w:ascii="TH Sarabun New" w:eastAsia="Times New Roman" w:hAnsi="TH Sarabun New" w:cs="TH Sarabun New" w:hint="cs"/>
+          <w:color w:val="000000" w:themeColor="text1"/>
+          <w:sz w:val="32"/>
+          <w:szCs w:val="32"/>
+          <w:cs/>
+          <w:lang w:eastAsia="en-GB"/>
+        </w:rPr>
+        <w:t xml:space="preserve">ได้ดำเนินการประเมินผลการสอนเรียบร้อยแล้ว เมื่อวันที่ </w:t>
+      </w:r>
+      <w:r>
+        <w:rPr>
+          <w:rFonts w:ascii="TH Sarabun New" w:eastAsia="Times New Roman" w:hAnsi="TH Sarabun New" w:cs="TH Sarabun New"/>
+          <w:color w:val="000000" w:themeColor="text1"/>
+          <w:sz w:val="32"/>
+          <w:szCs w:val="32"/>
+          <w:lang w:eastAsia="en-GB"/>
+        </w:rPr>
+        <w:t>๙ มีนาคม ๒๕๖๙</w:t>
+      </w:r>
+      <w:r>
+        <w:rPr>
+          <w:rFonts w:ascii="TH Sarabun New" w:eastAsia="Times New Roman" w:hAnsi="TH Sarabun New" w:cs="TH Sarabun New" w:hint="cs"/>
+          <w:color w:val="000000" w:themeColor="text1"/>
+          <w:sz w:val="32"/>
+          <w:szCs w:val="32"/>
+          <w:cs/>
+          <w:lang w:eastAsia="en-GB"/>
+        </w:rPr>
+        <w:t xml:space="preserve"> และได้ผ่านการรับรองจาก</w:t>
+      </w:r>
+      <w:r>
+        <w:rPr>
+          <w:rFonts w:ascii="TH Sarabun New" w:eastAsia="Times New Roman" w:hAnsi="TH Sarabun New" w:cs="TH Sarabun New" w:hint="cs"/>
+          <w:color w:val="000000" w:themeColor="text1"/>
+          <w:sz w:val="32"/>
+          <w:szCs w:val="32"/>
+          <w:cs/>
+          <w:lang w:eastAsia="en-GB"/>
+        </w:rPr>
+        <w:t>ที่</w:t>
+      </w:r>
+      <w:r>
+        <w:rPr>
+          <w:rFonts w:ascii="TH Sarabun New" w:eastAsia="Times New Roman" w:hAnsi="TH Sarabun New" w:cs="TH Sarabun New" w:hint="cs"/>
+          <w:color w:val="000000" w:themeColor="text1"/>
+          <w:sz w:val="32"/>
+          <w:szCs w:val="32"/>
+          <w:cs/>
+          <w:lang w:eastAsia="en-GB"/>
+        </w:rPr>
+        <w:t>ประชุมคณะกรรมการประจำวิทยาลัยการคอมพิวเตอร์ ในคราวประชุม</w:t>
+      </w:r>
+      <w:r>
+        <w:rPr>
+          <w:rFonts w:ascii="TH Sarabun New" w:eastAsia="Times New Roman" w:hAnsi="TH Sarabun New" w:cs="TH Sarabun New" w:hint="cs"/>
+          <w:color w:val="000000" w:themeColor="text1"/>
+          <w:sz w:val="32"/>
+          <w:szCs w:val="32"/>
+          <w:cs/>
+          <w:lang w:eastAsia="en-GB"/>
+        </w:rPr>
+        <w:t xml:space="preserve"> </w:t>
+      </w:r>
+      <w:r>
+        <w:rPr>
+          <w:rFonts w:ascii="TH Sarabun New" w:eastAsia="Times New Roman" w:hAnsi="TH Sarabun New" w:cs="TH Sarabun New" w:hint="cs"/>
+          <w:color w:val="000000" w:themeColor="text1"/>
+          <w:sz w:val="32"/>
+          <w:szCs w:val="32"/>
+          <w:cs/>
+          <w:lang w:eastAsia="en-GB"/>
+        </w:rPr>
+        <w:t xml:space="preserve">ครั้งที่ </w:t>
+      </w:r>
+      <w:r>
+        <w:rPr>
+          <w:rFonts w:ascii="TH Sarabun New" w:eastAsia="Times New Roman" w:hAnsi="TH Sarabun New" w:cs="TH Sarabun New"/>
+          <w:color w:val="000000" w:themeColor="text1"/>
+          <w:sz w:val="32"/>
+          <w:szCs w:val="32"/>
+          <w:lang w:eastAsia="en-GB"/>
+        </w:rPr>
+        <w:t> 120000</w:t>
+      </w:r>
       <w:r>
         <w:rPr>
           <w:rFonts w:ascii="TH Sarabun New" w:eastAsia="Times New Roman" w:hAnsi="TH Sarabun New" w:cs="TH Sarabun New"/>
@@ -832,7 +940,6 @@
         </w:rPr>
         <w:t/>
       </w:r>
-      <w:proofErr w:type="spellEnd"/>
       <w:r>
         <w:rPr>
           <w:rFonts w:ascii="TH Sarabun New" w:eastAsia="Times New Roman" w:hAnsi="TH Sarabun New" w:cs="TH Sarabun New"/>
@@ -852,63 +959,29 @@
           <w:cs/>
           <w:lang w:eastAsia="en-GB"/>
         </w:rPr>
-        <w:t xml:space="preserve"> ความ</w:t>
-      </w:r>
-      <w:r>
-        <w:rPr>
-          <w:rFonts w:ascii="TH Sarabun New" w:eastAsia="Times New Roman" w:hAnsi="TH Sarabun New" w:cs="TH Sarabun New" w:hint="cs"/>
-          <w:color w:val="000000" w:themeColor="text1"/>
-          <w:sz w:val="32"/>
-          <w:szCs w:val="32"/>
-          <w:cs/>
-          <w:lang w:eastAsia="en-GB"/>
-        </w:rPr>
-        <w:t>ละเอียดแจ้ง</w:t>
-      </w:r>
-      <w:r>
-        <w:rPr>
-          <w:rFonts w:ascii="TH Sarabun New" w:eastAsia="Times New Roman" w:hAnsi="TH Sarabun New" w:cs="TH Sarabun New" w:hint="cs"/>
-          <w:color w:val="000000" w:themeColor="text1"/>
-          <w:sz w:val="32"/>
-          <w:szCs w:val="32"/>
-          <w:cs/>
-          <w:lang w:eastAsia="en-GB"/>
-        </w:rPr>
-        <w:t>แ</w:t>
-      </w:r>
-      <w:r>
-        <w:rPr>
-          <w:rFonts w:ascii="TH Sarabun New" w:eastAsia="Times New Roman" w:hAnsi="TH Sarabun New" w:cs="TH Sarabun New" w:hint="cs"/>
-          <w:color w:val="000000" w:themeColor="text1"/>
-          <w:sz w:val="32"/>
-          <w:szCs w:val="32"/>
-          <w:cs/>
-          <w:lang w:eastAsia="en-GB"/>
-        </w:rPr>
-        <w:t>ล้วนั้น คณะกรรมการประเมินผลการสอน</w:t>
-      </w:r>
-      <w:r>
-        <w:rPr>
-          <w:rFonts w:ascii="TH Sarabun New" w:eastAsia="Times New Roman" w:hAnsi="TH Sarabun New" w:cs="TH Sarabun New" w:hint="cs"/>
-          <w:color w:val="000000" w:themeColor="text1"/>
-          <w:sz w:val="32"/>
-          <w:szCs w:val="32"/>
-          <w:cs/>
-          <w:lang w:eastAsia="en-GB"/>
-        </w:rPr>
-        <w:t xml:space="preserve">ได้ดำเนินการประเมินผลการสอนเรียบร้อยแล้ว เมื่อวันที่ </w:t>
-      </w:r>
-      <w:r>
-        <w:rPr>
-          <w:rFonts w:ascii="TH Sarabun New" w:eastAsia="Times New Roman" w:hAnsi="TH Sarabun New" w:cs="TH Sarabun New"/>
-          <w:color w:val="000000" w:themeColor="text1"/>
-          <w:sz w:val="32"/>
-          <w:szCs w:val="32"/>
-          <w:lang w:eastAsia="en-GB"/>
-        </w:rPr>
-        <w:t>9 มีนาคม 2569</w:t>
-      </w:r>
-      <w:proofErr w:type="spellStart"/>
+        <w:t xml:space="preserve"> </w:t>
+      </w:r>
+      <w:r>
+        <w:rPr>
+          <w:rFonts w:ascii="TH Sarabun New" w:eastAsia="Times New Roman" w:hAnsi="TH Sarabun New" w:cs="TH Sarabun New" w:hint="cs"/>
+          <w:color w:val="000000" w:themeColor="text1"/>
+          <w:sz w:val="32"/>
+          <w:szCs w:val="32"/>
+          <w:cs/>
+          <w:lang w:eastAsia="en-GB"/>
+        </w:rPr>
+        <w:t xml:space="preserve">เมื่อวันที่ </w:t>
+      </w:r>
+      <w:r>
+        <w:rPr>
+          <w:rFonts w:ascii="TH Sarabun New" w:eastAsia="Times New Roman" w:hAnsi="TH Sarabun New" w:cs="TH Sarabun New"/>
+          <w:color w:val="000000" w:themeColor="text1"/>
+          <w:sz w:val="32"/>
+          <w:szCs w:val="32"/>
+          <w:lang w:eastAsia="en-GB"/>
+        </w:rPr>
+        <w:t>๙ มีนาคม ๒๕๖๙</w:t>
+      </w:r>
       <w:r>
         <w:rPr>
           <w:rFonts w:ascii="TH Sarabun New" w:eastAsia="Times New Roman" w:hAnsi="TH Sarabun New" w:cs="TH Sarabun New"/>
@@ -919,7 +992,6 @@
         </w:rPr>
         <w:t/>
       </w:r>
-      <w:proofErr w:type="spellEnd"/>
       <w:r>
         <w:rPr>
           <w:rFonts w:ascii="TH Sarabun New" w:eastAsia="Times New Roman" w:hAnsi="TH Sarabun New" w:cs="TH Sarabun New"/>
@@ -939,29 +1011,26 @@
           <w:cs/>
           <w:lang w:eastAsia="en-GB"/>
         </w:rPr>
-        <w:t xml:space="preserve"> และได้ผ่านการรับรองจาก</w:t>
-      </w:r>
-      <w:r>
-        <w:rPr>
-          <w:rFonts w:ascii="TH Sarabun New" w:eastAsia="Times New Roman" w:hAnsi="TH Sarabun New" w:cs="TH Sarabun New" w:hint="cs"/>
-          <w:color w:val="000000" w:themeColor="text1"/>
-          <w:sz w:val="32"/>
-          <w:szCs w:val="32"/>
-          <w:cs/>
-          <w:lang w:eastAsia="en-GB"/>
-        </w:rPr>
-        <w:t>ที่</w:t>
-      </w:r>
-      <w:r>
-        <w:rPr>
-          <w:rFonts w:ascii="TH Sarabun New" w:eastAsia="Times New Roman" w:hAnsi="TH Sarabun New" w:cs="TH Sarabun New" w:hint="cs"/>
-          <w:color w:val="000000" w:themeColor="text1"/>
-          <w:sz w:val="32"/>
-          <w:szCs w:val="32"/>
-          <w:cs/>
-          <w:lang w:eastAsia="en-GB"/>
-        </w:rPr>
-        <w:t>ประชุมคณะกรรมการประจำวิทยาลัยการคอมพิวเตอร์ ในคราวประชุม</w:t>
+        <w:t xml:space="preserve"> ผลปรากฎว่า ผลการประเมินผลการสอนของท่านอยู่ในระดับ </w:t>
+      </w:r>
+      <w:r>
+        <w:rPr>
+          <w:rFonts w:ascii="TH Sarabun New" w:eastAsia="Times New Roman" w:hAnsi="TH Sarabun New" w:cs="TH Sarabun New"/>
+          <w:color w:val="000000" w:themeColor="text1"/>
+          <w:sz w:val="32"/>
+          <w:szCs w:val="32"/>
+          <w:lang w:eastAsia="en-GB"/>
+        </w:rPr>
+        <w:t>เชี่ยวชาญ</w:t>
+      </w:r>
+      <w:r>
+        <w:rPr>
+          <w:rFonts w:ascii="TH Sarabun New" w:hAnsi="TH Sarabun New" w:cs="TH Sarabun New"/>
+          <w:color w:val="000000" w:themeColor="text1"/>
+          <w:sz w:val="32"/>
+          <w:szCs w:val="32"/>
+        </w:rPr>
+        <w:t/>
       </w:r>
       <w:r>
         <w:rPr>
@@ -976,26 +1045,14 @@
       </w:r>
       <w:r>
         <w:rPr>
-          <w:rFonts w:ascii="TH Sarabun New" w:eastAsia="Times New Roman" w:hAnsi="TH Sarabun New" w:cs="TH Sarabun New" w:hint="cs"/>
-          <w:color w:val="000000" w:themeColor="text1"/>
-          <w:sz w:val="32"/>
-          <w:szCs w:val="32"/>
-          <w:cs/>
-          <w:lang w:eastAsia="en-GB"/>
-        </w:rPr>
-        <w:t xml:space="preserve">ครั้งที่ </w:t>
-      </w:r>
-      <w:r>
-        <w:rPr>
-          <w:rFonts w:ascii="TH Sarabun New" w:eastAsia="Times New Roman" w:hAnsi="TH Sarabun New" w:cs="TH Sarabun New"/>
-          <w:color w:val="000000" w:themeColor="text1"/>
-          <w:sz w:val="32"/>
-          <w:szCs w:val="32"/>
-          <w:lang w:eastAsia="en-GB"/>
-        </w:rPr>
-        <w:t> 120000</w:t>
-      </w:r>
-      <w:proofErr w:type="spellStart"/>
+          <w:rFonts w:ascii="TH Sarabun New" w:eastAsia="Times New Roman" w:hAnsi="TH Sarabun New" w:cs="TH Sarabun New"/>
+          <w:color w:val="000000" w:themeColor="text1"/>
+          <w:sz w:val="32"/>
+          <w:szCs w:val="32"/>
+          <w:lang w:eastAsia="en-GB"/>
+        </w:rPr>
+        <w:t>มี</w:t>
+      </w:r>
       <w:r>
         <w:rPr>
           <w:rFonts w:ascii="TH Sarabun New" w:eastAsia="Times New Roman" w:hAnsi="TH Sarabun New" w:cs="TH Sarabun New"/>
@@ -1016,7 +1073,6 @@
         </w:rPr>
         <w:t/>
       </w:r>
-      <w:proofErr w:type="spellEnd"/>
       <w:r>
         <w:rPr>
           <w:rFonts w:ascii="TH Sarabun New" w:eastAsia="Times New Roman" w:hAnsi="TH Sarabun New" w:cs="TH Sarabun New"/>
@@ -1029,39 +1085,6 @@
       </w:r>
       <w:r>
         <w:rPr>
-          <w:rFonts w:ascii="TH Sarabun New" w:eastAsia="Times New Roman" w:hAnsi="TH Sarabun New" w:cs="TH Sarabun New" w:hint="cs"/>
-          <w:color w:val="000000" w:themeColor="text1"/>
-          <w:sz w:val="32"/>
-          <w:szCs w:val="32"/>
-          <w:cs/>
-          <w:lang w:eastAsia="en-GB"/>
-        </w:rPr>
-        <w:t xml:space="preserve"> </w:t>
-      </w:r>
-      <w:r>
-        <w:rPr>
-          <w:rFonts w:ascii="TH Sarabun New" w:eastAsia="Times New Roman" w:hAnsi="TH Sarabun New" w:cs="TH Sarabun New" w:hint="cs"/>
-          <w:color w:val="000000" w:themeColor="text1"/>
-          <w:sz w:val="32"/>
-          <w:szCs w:val="32"/>
-          <w:cs/>
-          <w:lang w:eastAsia="en-GB"/>
-        </w:rPr>
-        <w:t xml:space="preserve">เมื่อวันที่ </w:t>
-      </w:r>
-      <w:r>
-        <w:rPr>
-          <w:rFonts w:ascii="TH Sarabun New" w:eastAsia="Times New Roman" w:hAnsi="TH Sarabun New" w:cs="TH Sarabun New"/>
-          <w:color w:val="000000" w:themeColor="text1"/>
-          <w:sz w:val="32"/>
-          <w:szCs w:val="32"/>
-          <w:lang w:eastAsia="en-GB"/>
-        </w:rPr>
-        <w:t>9 มีนาคม 2569</w:t>
-      </w:r>
-      <w:proofErr w:type="spellStart"/>
-      <w:r>
-        <w:rPr>
           <w:rFonts w:ascii="TH Sarabun New" w:eastAsia="Times New Roman" w:hAnsi="TH Sarabun New" w:cs="TH Sarabun New"/>
           <w:color w:val="000000" w:themeColor="text1"/>
           <w:sz w:val="32"/>
@@ -1070,131 +1093,6 @@
         </w:rPr>
         <w:t/>
       </w:r>
-      <w:r>
-        <w:rPr>
-          <w:rFonts w:ascii="TH Sarabun New" w:eastAsia="Times New Roman" w:hAnsi="TH Sarabun New" w:cs="TH Sarabun New"/>
-          <w:color w:val="000000" w:themeColor="text1"/>
-          <w:sz w:val="32"/>
-          <w:szCs w:val="32"/>
-          <w:lang w:eastAsia="en-GB"/>
-        </w:rPr>
-        <w:t/>
-      </w:r>
-      <w:proofErr w:type="spellEnd"/>
-      <w:r>
-        <w:rPr>
-          <w:rFonts w:ascii="TH Sarabun New" w:eastAsia="Times New Roman" w:hAnsi="TH Sarabun New" w:cs="TH Sarabun New"/>
-          <w:color w:val="000000" w:themeColor="text1"/>
-          <w:sz w:val="32"/>
-          <w:szCs w:val="32"/>
-          <w:lang w:eastAsia="en-GB"/>
-        </w:rPr>
-        <w:t/>
-      </w:r>
-      <w:r>
-        <w:rPr>
-          <w:rFonts w:ascii="TH Sarabun New" w:eastAsia="Times New Roman" w:hAnsi="TH Sarabun New" w:cs="TH Sarabun New" w:hint="cs"/>
-          <w:color w:val="000000" w:themeColor="text1"/>
-          <w:sz w:val="32"/>
-          <w:szCs w:val="32"/>
-          <w:cs/>
-          <w:lang w:eastAsia="en-GB"/>
-        </w:rPr>
-        <w:t xml:space="preserve"> ผลปรากฎว่า ผลการประเมินผลการสอนของท่านอยู่ในระดับ </w:t>
-      </w:r>
-      <w:r>
-        <w:rPr>
-          <w:rFonts w:ascii="TH Sarabun New" w:eastAsia="Times New Roman" w:hAnsi="TH Sarabun New" w:cs="TH Sarabun New"/>
-          <w:color w:val="000000" w:themeColor="text1"/>
-          <w:sz w:val="32"/>
-          <w:szCs w:val="32"/>
-          <w:lang w:eastAsia="en-GB"/>
-        </w:rPr>
-        <w:t>เชี่ยวชาญ</w:t>
-      </w:r>
-      <w:proofErr w:type="spellStart"/>
-      <w:r>
-        <w:rPr>
-          <w:rFonts w:ascii="TH Sarabun New" w:hAnsi="TH Sarabun New" w:cs="TH Sarabun New"/>
-          <w:color w:val="000000" w:themeColor="text1"/>
-          <w:sz w:val="32"/>
-          <w:szCs w:val="32"/>
-        </w:rPr>
-        <w:t/>
-      </w:r>
-      <w:proofErr w:type="spellEnd"/>
-      <w:r>
-        <w:rPr>
-          <w:rFonts w:ascii="TH Sarabun New" w:hAnsi="TH Sarabun New" w:cs="TH Sarabun New"/>
-          <w:color w:val="000000" w:themeColor="text1"/>
-          <w:sz w:val="32"/>
-          <w:szCs w:val="32"/>
-        </w:rPr>
-        <w:t/>
-      </w:r>
-      <w:r>
-        <w:rPr>
-          <w:rFonts w:ascii="TH Sarabun New" w:eastAsia="Times New Roman" w:hAnsi="TH Sarabun New" w:cs="TH Sarabun New" w:hint="cs"/>
-          <w:color w:val="000000" w:themeColor="text1"/>
-          <w:sz w:val="32"/>
-          <w:szCs w:val="32"/>
-          <w:cs/>
-          <w:lang w:eastAsia="en-GB"/>
-        </w:rPr>
-        <w:t xml:space="preserve"> </w:t>
-      </w:r>
-      <w:r>
-        <w:rPr>
-          <w:rFonts w:ascii="TH Sarabun New" w:eastAsia="Times New Roman" w:hAnsi="TH Sarabun New" w:cs="TH Sarabun New"/>
-          <w:color w:val="000000" w:themeColor="text1"/>
-          <w:sz w:val="32"/>
-          <w:szCs w:val="32"/>
-          <w:lang w:eastAsia="en-GB"/>
-        </w:rPr>
-        <w:t>มี</w:t>
-      </w:r>
-      <w:proofErr w:type="spellStart"/>
-      <w:r>
-        <w:rPr>
-          <w:rFonts w:ascii="TH Sarabun New" w:eastAsia="Times New Roman" w:hAnsi="TH Sarabun New" w:cs="TH Sarabun New"/>
-          <w:color w:val="000000" w:themeColor="text1"/>
-          <w:sz w:val="32"/>
-          <w:szCs w:val="32"/>
-          <w:lang w:eastAsia="en-GB"/>
-        </w:rPr>
-        <w:t/>
-      </w:r>
-      <w:r>
-        <w:rPr>
-          <w:rFonts w:ascii="TH Sarabun New" w:eastAsia="Times New Roman" w:hAnsi="TH Sarabun New" w:cs="TH Sarabun New"/>
-          <w:color w:val="000000" w:themeColor="text1"/>
-          <w:sz w:val="32"/>
-          <w:szCs w:val="32"/>
-          <w:lang w:eastAsia="en-GB"/>
-        </w:rPr>
-        <w:t/>
-      </w:r>
-      <w:r>
-        <w:rPr>
-          <w:rFonts w:ascii="TH Sarabun New" w:eastAsia="Times New Roman" w:hAnsi="TH Sarabun New" w:cs="TH Sarabun New"/>
-          <w:color w:val="000000" w:themeColor="text1"/>
-          <w:sz w:val="32"/>
-          <w:szCs w:val="32"/>
-          <w:lang w:eastAsia="en-GB"/>
-        </w:rPr>
-        <w:t/>
-      </w:r>
-      <w:r>
-        <w:rPr>
-          <w:rFonts w:ascii="TH Sarabun New" w:eastAsia="Times New Roman" w:hAnsi="TH Sarabun New" w:cs="TH Sarabun New"/>
-          <w:color w:val="000000" w:themeColor="text1"/>
-          <w:sz w:val="32"/>
-          <w:szCs w:val="32"/>
-          <w:lang w:eastAsia="en-GB"/>
-        </w:rPr>
-        <w:t/>
-      </w:r>
-      <w:proofErr w:type="spellEnd"/>
       <w:r>
         <w:rPr>
           <w:rFonts w:ascii="TH Sarabun New" w:eastAsia="Times New Roman" w:hAnsi="TH Sarabun New" w:cs="TH Sarabun New"/>
@@ -1242,7 +1140,7 @@
         <w:ind w:firstLine="720"/>
         <w:jc w:val="thaiDistribute"/>
         <w:rPr>
-          <w:rFonts w:ascii="TH Sarabun New" w:eastAsia="Times New Roman" w:hAnsi="TH Sarabun New" w:cs="TH Sarabun New" w:hint="cs"/>
+          <w:rFonts w:ascii="TH Sarabun New" w:eastAsia="Times New Roman" w:hAnsi="TH Sarabun New" w:cs="TH Sarabun New"/>
           <w:sz w:val="16"/>
           <w:szCs w:val="16"/>
           <w:lang w:eastAsia="en-GB"/>
@@ -1349,28 +1247,6 @@
         </w:rPr>
         <w:t>ศาสตราจารย์</w:t>
       </w:r>
-      <w:proofErr w:type="spellStart"/>
-      <w:r>
-        <w:rPr>
-          <w:rFonts w:ascii="TH Sarabun New" w:eastAsia="Times New Roman" w:hAnsi="TH Sarabun New" w:cs="TH Sarabun New"/>
-          <w:color w:val="000000" w:themeColor="text1"/>
-          <w:sz w:val="32"/>
-          <w:szCs w:val="32"/>
-          <w:lang w:eastAsia="en-GB"/>
-        </w:rPr>
-        <w:t/>
-      </w:r>
-      <w:proofErr w:type="spellEnd"/>
-      <w:r>
-        <w:rPr>
-          <w:rFonts w:ascii="TH Sarabun New" w:eastAsia="Times New Roman" w:hAnsi="TH Sarabun New" w:cs="TH Sarabun New"/>
-          <w:color w:val="000000" w:themeColor="text1"/>
-          <w:sz w:val="32"/>
-          <w:szCs w:val="32"/>
-          <w:lang w:eastAsia="en-GB"/>
-        </w:rPr>
-        <w:t/>
-      </w:r>
       <w:r>
         <w:rPr>
           <w:rFonts w:ascii="TH Sarabun New" w:eastAsia="Times New Roman" w:hAnsi="TH Sarabun New" w:cs="TH Sarabun New" w:hint="cs"/>
@@ -1403,26 +1279,6 @@
         </w:rPr>
         <w:t xml:space="preserve">ภายในวันที่ </w:t>
       </w:r>
-      <w:r>
-        <w:rPr>
-          <w:rFonts w:ascii="TH Sarabun New" w:eastAsia="Angsana New" w:hAnsi="TH Sarabun New" w:cs="TH Sarabun New"/>
-          <w:color w:val="000000" w:themeColor="text1"/>
-          <w:sz w:val="32"/>
-          <w:szCs w:val="32"/>
-        </w:rPr>
-        <w:t>9 มีนาคม 2569</w:t>
-      </w:r>
-      <w:proofErr w:type="spellStart"/>
-      <w:r>
-        <w:rPr>
-          <w:rFonts w:ascii="TH Sarabun New" w:eastAsia="Angsana New" w:hAnsi="TH Sarabun New" w:cs="TH Sarabun New"/>
-          <w:color w:val="000000" w:themeColor="text1"/>
-          <w:sz w:val="32"/>
-          <w:szCs w:val="32"/>
-        </w:rPr>
-        <w:t/>
-      </w:r>
-      <w:proofErr w:type="spellEnd"/>
       <w:r>
         <w:rPr>
           <w:rFonts w:ascii="TH Sarabun New" w:eastAsia="Angsana New" w:hAnsi="TH Sarabun New" w:cs="TH Sarabun New"/>
@@ -1503,7 +1359,7 @@
       <w:pPr>
         <w:ind w:right="-421"/>
         <w:rPr>
-          <w:rFonts w:ascii="TH Sarabun New" w:hAnsi="TH Sarabun New" w:cs="TH Sarabun New" w:hint="cs"/>
+          <w:rFonts w:ascii="TH Sarabun New" w:hAnsi="TH Sarabun New" w:cs="TH Sarabun New"/>
           <w:sz w:val="32"/>
           <w:szCs w:val="32"/>
           <w:cs/>
@@ -1540,26 +1396,6 @@
         </w:rPr>
         <w:t>รองศาสตราจารย์สม ดีx</w:t>
       </w:r>
-      <w:proofErr w:type="spellStart"/>
-      <w:r>
-        <w:rPr>
-          <w:rFonts w:ascii="TH Sarabun New" w:hAnsi="TH Sarabun New" w:cs="TH Sarabun New"/>
-          <w:color w:val="000000" w:themeColor="text1"/>
-          <w:sz w:val="32"/>
-          <w:szCs w:val="32"/>
-        </w:rPr>
-        <w:t/>
-      </w:r>
-      <w:proofErr w:type="spellEnd"/>
-      <w:r>
-        <w:rPr>
-          <w:rFonts w:ascii="TH Sarabun New" w:hAnsi="TH Sarabun New" w:cs="TH Sarabun New"/>
-          <w:color w:val="000000" w:themeColor="text1"/>
-          <w:sz w:val="32"/>
-          <w:szCs w:val="32"/>
-        </w:rPr>
-        <w:t/>
-      </w:r>
       <w:r>
         <w:rPr>
           <w:rFonts w:ascii="TH Sarabun New" w:hAnsi="TH Sarabun New" w:cs="TH Sarabun New"/>
@@ -1589,26 +1425,6 @@
           <w:szCs w:val="32"/>
         </w:rPr>
         <w:t>คณบดีวิทยาลัยการคอมพิวเตอร์</w:t>
-      </w:r>
-      <w:proofErr w:type="spellStart"/>
-      <w:r>
-        <w:rPr>
-          <w:rFonts w:ascii="TH Sarabun New" w:hAnsi="TH Sarabun New" w:cs="TH Sarabun New"/>
-          <w:color w:val="000000" w:themeColor="text1"/>
-          <w:sz w:val="32"/>
-          <w:szCs w:val="32"/>
-        </w:rPr>
-        <w:t/>
-      </w:r>
-      <w:proofErr w:type="spellEnd"/>
-      <w:r>
-        <w:rPr>
-          <w:rFonts w:ascii="TH Sarabun New" w:hAnsi="TH Sarabun New" w:cs="TH Sarabun New"/>
-          <w:color w:val="000000" w:themeColor="text1"/>
-          <w:sz w:val="32"/>
-          <w:szCs w:val="32"/>
-        </w:rPr>
-        <w:t/>
       </w:r>
     </w:p>
     <w:sectPr>

</xml_diff>